<commit_message>
Payment terms and running totals
Co-Authored-By: Claude Opus 5 (1M context) <noreply@anthropic.com>
</commit_message>
<xml_diff>
--- a/src/ModernSalesInvoice.docx
+++ b/src/ModernSalesInvoice.docx
@@ -6517,6 +6517,8 @@
  
              < R e p o r t N a m e > R e p o r t   N a m e < / R e p o r t N a m e >   
+             < R e p o r t C a p t i o n > R e p o r t   C a p t i o n < / R e p o r t C a p t i o n > + 
              < A b o u t T h i s R e p o r t T i t l e > A b o u t   T h i s   R e p o r t   T i t l e < / A b o u t T h i s R e p o r t T i t l e >   
              < A b o u t T h i s R e p o r t T e x t > A b o u t   T h i s   R e p o r t   T e x t < / A b o u t T h i s R e p o r t T e x t > @@ -6563,6 +6565,84 @@
  
          < / R e p o r t R e q u e s t >   
+         < C o m p a n y M e t a d a t a > + 
+             < C o m p a n y N a m e > C o m p a n y   N a m e < / C o m p a n y N a m e > + 
+             < C o m p a n y D i s p l a y N a m e > C o m p a n y   D i s p l a y   N a m e < / C o m p a n y D i s p l a y N a m e > + 
+             < C o m p a n y A d d r e s s L i n e s > + 
+                 < C o m p a n y A d d r e s s L i n e 1 > C o m p a n y   A d d r e s s   L i n e   1 < / C o m p a n y A d d r e s s L i n e 1 > + 
+                 < C o m p a n y A d d r e s s L i n e 2 > C o m p a n y   A d d r e s s   L i n e   2 < / C o m p a n y A d d r e s s L i n e 2 > + 
+                 < C o m p a n y A d d r e s s L i n e 3 > C o m p a n y   A d d r e s s   L i n e   3 < / C o m p a n y A d d r e s s L i n e 3 > + 
+                 < C o m p a n y A d d r e s s L i n e 4 > C o m p a n y   A d d r e s s   L i n e   4 < / C o m p a n y A d d r e s s L i n e 4 > + 
+                 < C o m p a n y A d d r e s s L i n e 5 > C o m p a n y   A d d r e s s   L i n e   5 < / C o m p a n y A d d r e s s L i n e 5 > + 
+                 < C o m p a n y A d d r e s s L i n e 6 > C o m p a n y   A d d r e s s   L i n e   6 < / C o m p a n y A d d r e s s L i n e 6 > + 
+                 < C o m p a n y A d d r e s s L i n e 7 > C o m p a n y   A d d r e s s   L i n e   7 < / C o m p a n y A d d r e s s L i n e 7 > + 
+                 < C o m p a n y A d d r e s s L i n e 8 > C o m p a n y   A d d r e s s   L i n e   8 < / C o m p a n y A d d r e s s L i n e 8 > + 
+             < / C o m p a n y A d d r e s s L i n e s > + 
+             < C o m p a n y P h o n e > C o m p a n y   P h o n e < / C o m p a n y P h o n e > + 
+             < C o m p a n y P h o n e C a p t i o n > C o m p a n y   P h o n e   C a p t i o n < / C o m p a n y P h o n e C a p t i o n > + 
+             < C o m p a n y F a x N o > C o m p a n y   F a x   N o . < / C o m p a n y F a x N o > + 
+             < C o m p a n y F a x N o C a p t i o n > C o m p a n y   F a x   N o .   C a p t i o n < / C o m p a n y F a x N o C a p t i o n > + 
+             < C o m p a n y E m a i l > C o m p a n y   E m a i l < / C o m p a n y E m a i l > + 
+             < C o m p a n y E m a i l C a p t i o n > C o m p a n y   E m a i l   C a p t i o n < / C o m p a n y E m a i l C a p t i o n > + 
+             < C o m p a n y H o m e P a g e > C o m p a n y   H o m e   P a g e < / C o m p a n y H o m e P a g e > + 
+             < C o m p a n y H o m e P a g e C a p t i o n > C o m p a n y   H o m e   P a g e   C a p t i o n < / C o m p a n y H o m e P a g e C a p t i o n > + 
+             < C o m p a n y L o g o > C o m p a n y   L o g o < / C o m p a n y L o g o > + 
+             < C o m p a n y V A T R e g i s t r a t i o n N o > C o m p a n y   V A T   R e g i s t r a t i o n   N o . < / C o m p a n y V A T R e g i s t r a t i o n N o > + 
+             < C o m p a n y V A T R e g i s t r a t i o n N o C a p t i o n > C o m p a n y   V A T   R e g i s t r a t i o n   N o .   C a p t i o n < / C o m p a n y V A T R e g i s t r a t i o n N o C a p t i o n > + 
+             < C o m p a n y R e g i s t r a t i o n N o > C o m p a n y   R e g i s t r a t i o n   N o . < / C o m p a n y R e g i s t r a t i o n N o > + 
+             < C o m p a n y R e g i s t r a t i o n N o C a p t i o n > C o m p a n y   R e g i s t r a t i o n   N o .   C a p t i o n < / C o m p a n y R e g i s t r a t i o n N o C a p t i o n > + 
+             < C o m p a n y B a n k N a m e > C o m p a n y   B a n k   N a m e < / C o m p a n y B a n k N a m e > + 
+             < C o m p a n y B a n k N a m e C a p t i o n > C o m p a n y   B a n k   N a m e   C a p t i o n < / C o m p a n y B a n k N a m e C a p t i o n > + 
+             < C o m p a n y B a n k A c c o u n t N o > C o m p a n y   B a n k   A c c o u n t   N o . < / C o m p a n y B a n k A c c o u n t N o > + 
+             < C o m p a n y B a n k A c c o u n t N o C a p t i o n > C o m p a n y   B a n k   A c c o u n t   N o .   C a p t i o n < / C o m p a n y B a n k A c c o u n t N o C a p t i o n > + 
+             < C o m p a n y B a n k B r a n c h N o > C o m p a n y   B a n k   B r a n c h   N o . < / C o m p a n y B a n k B r a n c h N o > + 
+             < C o m p a n y B a n k B r a n c h N o C a p t i o n > C o m p a n y   B a n k   B r a n c h   N o .   C a p t i o n < / C o m p a n y B a n k B r a n c h N o C a p t i o n > + 
+             < C o m p a n y I B A N > C o m p a n y   I B A N < / C o m p a n y I B A N > + 
+             < C o m p a n y I B A N C a p t i o n > C o m p a n y   I B A N   C a p t i o n < / C o m p a n y I B A N C a p t i o n > + 
+             < C o m p a n y B a n k S W I F T > C o m p a n y   B a n k   S W I F T < / C o m p a n y B a n k S W I F T > + 
+             < C o m p a n y B a n k S W I F T C a p t i o n > C o m p a n y   B a n k   S W I F T   C a p t i o n < / C o m p a n y B a n k S W I F T C a p t i o n > + 
+             < C o m p a n y G i r o N o > C o m p a n y   G i r o   N o . < / C o m p a n y G i r o N o > + 
+             < C o m p a n y G i r o N o C a p t i o n > C o m p a n y   G i r o   N o .   C a p t i o n < / C o m p a n y G i r o N o C a p t i o n > + 
+         < / C o m p a n y M e t a d a t a > + 
      < / B C R e p o r t I n f o r m a t i o n >   
      < H e a d e r > @@ -6931,6 +7011,10 @@
  
              < Q u a n t i t y _ L i n e _ L b l 2 > Q u a n t i t y _ L i n e _ L b l 2 < / Q u a n t i t y _ L i n e _ L b l 2 >   
+             < R u n n i n g T o t a l > R u n n i n g T o t a l < / R u n n i n g T o t a l > + 
+             < R u n n i n g T o t a l B e f o r e > R u n n i n g T o t a l B e f o r e < / R u n n i n g T o t a l B e f o r e > + 
              < S h i p m e n t D a t e _ L i n e > S h i p m e n t D a t e _ L i n e < / S h i p m e n t D a t e _ L i n e >   
              < S h i p m e n t D a t e _ L i n e _ L b l > S h i p m e n t D a t e _ L i n e _ L b l < / S h i p m e n t D a t e _ L i n e _ L b l > @@ -7280,6 +7364,14 @@
              < T o t a l V A T B a s e L C Y > T o t a l V A T B a s e L C Y < / T o t a l V A T B a s e L C Y >   
          < / T o t a l s > + 
+         < S h o w T e r m s > + 
+             < T e r m s C a p t i o n > T e r m s C a p t i o n < / T e r m s C a p t i o n > + 
+             < T e r m s T e x t > T e r m s T e x t < / T e r m s T e x t > + 
+         < / S h o w T e r m s >   
      < / H e a d e r >   
@@ -7306,6 +7398,8 @@
  
              < R e p o r t N a m e > R e p o r t   N a m e < / R e p o r t N a m e >   
+             < R e p o r t C a p t i o n > R e p o r t   C a p t i o n < / R e p o r t C a p t i o n > + 
              < A b o u t T h i s R e p o r t T i t l e > A b o u t   T h i s   R e p o r t   T i t l e < / A b o u t T h i s R e p o r t T i t l e >   
              < A b o u t T h i s R e p o r t T e x t > A b o u t   T h i s   R e p o r t   T e x t < / A b o u t T h i s R e p o r t T e x t > @@ -7352,6 +7446,84 @@
  
          < / R e p o r t R e q u e s t >   
+         < C o m p a n y M e t a d a t a > + 
+             < C o m p a n y N a m e > C o m p a n y   N a m e < / C o m p a n y N a m e > + 
+             < C o m p a n y D i s p l a y N a m e > C o m p a n y   D i s p l a y   N a m e < / C o m p a n y D i s p l a y N a m e > + 
+             < C o m p a n y A d d r e s s L i n e s > + 
+                 < C o m p a n y A d d r e s s L i n e 1 > C o m p a n y   A d d r e s s   L i n e   1 < / C o m p a n y A d d r e s s L i n e 1 > + 
+                 < C o m p a n y A d d r e s s L i n e 2 > C o m p a n y   A d d r e s s   L i n e   2 < / C o m p a n y A d d r e s s L i n e 2 > + 
+                 < C o m p a n y A d d r e s s L i n e 3 > C o m p a n y   A d d r e s s   L i n e   3 < / C o m p a n y A d d r e s s L i n e 3 > + 
+                 < C o m p a n y A d d r e s s L i n e 4 > C o m p a n y   A d d r e s s   L i n e   4 < / C o m p a n y A d d r e s s L i n e 4 > + 
+                 < C o m p a n y A d d r e s s L i n e 5 > C o m p a n y   A d d r e s s   L i n e   5 < / C o m p a n y A d d r e s s L i n e 5 > + 
+                 < C o m p a n y A d d r e s s L i n e 6 > C o m p a n y   A d d r e s s   L i n e   6 < / C o m p a n y A d d r e s s L i n e 6 > + 
+                 < C o m p a n y A d d r e s s L i n e 7 > C o m p a n y   A d d r e s s   L i n e   7 < / C o m p a n y A d d r e s s L i n e 7 > + 
+                 < C o m p a n y A d d r e s s L i n e 8 > C o m p a n y   A d d r e s s   L i n e   8 < / C o m p a n y A d d r e s s L i n e 8 > + 
+             < / C o m p a n y A d d r e s s L i n e s > + 
+             < C o m p a n y P h o n e > C o m p a n y   P h o n e < / C o m p a n y P h o n e > + 
+             < C o m p a n y P h o n e C a p t i o n > C o m p a n y   P h o n e   C a p t i o n < / C o m p a n y P h o n e C a p t i o n > + 
+             < C o m p a n y F a x N o > C o m p a n y   F a x   N o . < / C o m p a n y F a x N o > + 
+             < C o m p a n y F a x N o C a p t i o n > C o m p a n y   F a x   N o .   C a p t i o n < / C o m p a n y F a x N o C a p t i o n > + 
+             < C o m p a n y E m a i l > C o m p a n y   E m a i l < / C o m p a n y E m a i l > + 
+             < C o m p a n y E m a i l C a p t i o n > C o m p a n y   E m a i l   C a p t i o n < / C o m p a n y E m a i l C a p t i o n > + 
+             < C o m p a n y H o m e P a g e > C o m p a n y   H o m e   P a g e < / C o m p a n y H o m e P a g e > + 
+             < C o m p a n y H o m e P a g e C a p t i o n > C o m p a n y   H o m e   P a g e   C a p t i o n < / C o m p a n y H o m e P a g e C a p t i o n > + 
+             < C o m p a n y L o g o > C o m p a n y   L o g o < / C o m p a n y L o g o > + 
+             < C o m p a n y V A T R e g i s t r a t i o n N o > C o m p a n y   V A T   R e g i s t r a t i o n   N o . < / C o m p a n y V A T R e g i s t r a t i o n N o > + 
+             < C o m p a n y V A T R e g i s t r a t i o n N o C a p t i o n > C o m p a n y   V A T   R e g i s t r a t i o n   N o .   C a p t i o n < / C o m p a n y V A T R e g i s t r a t i o n N o C a p t i o n > + 
+             < C o m p a n y R e g i s t r a t i o n N o > C o m p a n y   R e g i s t r a t i o n   N o . < / C o m p a n y R e g i s t r a t i o n N o > + 
+             < C o m p a n y R e g i s t r a t i o n N o C a p t i o n > C o m p a n y   R e g i s t r a t i o n   N o .   C a p t i o n < / C o m p a n y R e g i s t r a t i o n N o C a p t i o n > + 
+             < C o m p a n y B a n k N a m e > C o m p a n y   B a n k   N a m e < / C o m p a n y B a n k N a m e > + 
+             < C o m p a n y B a n k N a m e C a p t i o n > C o m p a n y   B a n k   N a m e   C a p t i o n < / C o m p a n y B a n k N a m e C a p t i o n > + 
+             < C o m p a n y B a n k A c c o u n t N o > C o m p a n y   B a n k   A c c o u n t   N o . < / C o m p a n y B a n k A c c o u n t N o > + 
+             < C o m p a n y B a n k A c c o u n t N o C a p t i o n > C o m p a n y   B a n k   A c c o u n t   N o .   C a p t i o n < / C o m p a n y B a n k A c c o u n t N o C a p t i o n > + 
+             < C o m p a n y B a n k B r a n c h N o > C o m p a n y   B a n k   B r a n c h   N o . < / C o m p a n y B a n k B r a n c h N o > + 
+             < C o m p a n y B a n k B r a n c h N o C a p t i o n > C o m p a n y   B a n k   B r a n c h   N o .   C a p t i o n < / C o m p a n y B a n k B r a n c h N o C a p t i o n > + 
+             < C o m p a n y I B A N > C o m p a n y   I B A N < / C o m p a n y I B A N > + 
+             < C o m p a n y I B A N C a p t i o n > C o m p a n y   I B A N   C a p t i o n < / C o m p a n y I B A N C a p t i o n > + 
+             < C o m p a n y B a n k S W I F T > C o m p a n y   B a n k   S W I F T < / C o m p a n y B a n k S W I F T > + 
+             < C o m p a n y B a n k S W I F T C a p t i o n > C o m p a n y   B a n k   S W I F T   C a p t i o n < / C o m p a n y B a n k S W I F T C a p t i o n > + 
+             < C o m p a n y G i r o N o > C o m p a n y   G i r o   N o . < / C o m p a n y G i r o N o > + 
+             < C o m p a n y G i r o N o C a p t i o n > C o m p a n y   G i r o   N o .   C a p t i o n < / C o m p a n y G i r o N o C a p t i o n > + 
+         < / C o m p a n y M e t a d a t a > + 
      < / B C R e p o r t I n f o r m a t i o n >   
      < T o o l t i p s > @@ -7802,6 +7974,10 @@
  
              < Q u a n t i t y _ L i n e _ L b l 2   E l e m e n t T y p e = " C o l u m n "   E l e m e n t I d = " 1 7 8 3 0 6 9 6 9 6 "   D a t a T y p e = " L a b e l " > Q u a n t i t y _ L i n e _ L b l 2 < / Q u a n t i t y _ L i n e _ L b l 2 >   
+             < R u n n i n g T o t a l   E l e m e n t T y p e = " C o l u m n "   E l e m e n t I d = " 1 1 0 9 8 5 1 0 3 2 "   D a t a T y p e = " D e c i m a l " > R u n n i n g T o t a l < / R u n n i n g T o t a l > + 
+             < R u n n i n g T o t a l B e f o r e   E l e m e n t T y p e = " C o l u m n "   E l e m e n t I d = " 1 7 7 3 3 8 5 4 4 9 "   D a t a T y p e = " D e c i m a l " > R u n n i n g T o t a l B e f o r e < / R u n n i n g T o t a l B e f o r e > + 
              < S h i p m e n t D a t e _ L i n e   E l e m e n t T y p e = " C o l u m n "   E l e m e n t I d = " 1 6 7 3 3 7 5 4 1 6 "   D a t a T y p e = " S t r i n g " > S h i p m e n t D a t e _ L i n e < / S h i p m e n t D a t e _ L i n e >   
              < S h i p m e n t D a t e _ L i n e _ L b l   E l e m e n t T y p e = " C o l u m n "   E l e m e n t I d = " 8 5 3 2 2 4 3 6 3 "   D a t a T y p e = " L a b e l " > S h i p m e n t D a t e _ L i n e _ L b l < / S h i p m e n t D a t e _ L i n e _ L b l > @@ -8151,6 +8327,14 @@
              < T o t a l V A T B a s e L C Y   E l e m e n t T y p e = " C o l u m n "   E l e m e n t I d = " 8 3 4 4 5 0 5 2 1 "   D a t a T y p e = " D e c i m a l " > T o t a l V A T B a s e L C Y < / T o t a l V A T B a s e L C Y >   
          < / T o t a l s > + 
+         < S h o w T e r m s   E l e m e n t T y p e = " D a t a I t e m "   E l e m e n t I d = " 2 0 8 0 3 0 4 0 8 5 " > + 
+             < T e r m s C a p t i o n   E l e m e n t T y p e = " C o l u m n "   E l e m e n t I d = " 8 9 5 4 2 2 1 5 4 "   D a t a T y p e = " T e x t " > T e r m s C a p t i o n < / T e r m s C a p t i o n > + 
+             < T e r m s T e x t   E l e m e n t T y p e = " C o l u m n "   E l e m e n t I d = " 1 4 3 8 0 6 3 1 8 7 "   D a t a T y p e = " T e x t " > T e r m s T e x t < / T e r m s T e x t > + 
+         < / S h o w T e r m s >   
      < / H e a d e r >   

</xml_diff>